<commit_message>
checkpoint: 多年期 Phase A（分年甘特圖 + 甘特可編輯）+ Step4 審查改版 WIP [skip deploy]
多年期 Phase A（已驗證 build / lint / snapshot:check / inject-doc2 / docxtemplater 實渲染 / 瀏覽器 DOM）：
- 分年甘特圖：docgen/schedule.ts 的 gantt_rows 改為巢狀 gantt_years（依年切 12 格）；
  inject-doc2.cjs 用 {#gantt_years} 包住表頭+資料列，逐年重複出 12 月甘特表。
- 甘特工作項目可編輯：gantt.ts 預設改一列空白、7 項「資料分析」範本改按鈕載入；
  Step3Research.tsx 工作項目改可編輯 Input + 新增/刪除列 + 帶入範本。

⚠️ 一併夾帶（非本次多年期工作，依使用者要求一起 checkpoint）：
- Step4 IRB / 審查判斷器改版：ReviewTypeScreening、reviewClassifier、Step4IRB/ 子元件、
  exemptIrbText、inject-doc5（DOC-5 隱私三段）、classifier-snapshot。
- scripts/baselines/placeholders.json 同時反映兩個功能，未來分功能時需重立 baseline。

Phase B（分年經費）尚未開始，見 memory/project_multiyear.md + plans/whimsical-imagining-goose.md。

Co-Authored-By: Claude Opus 4.8 <noreply@anthropic.com>
</commit_message>
<xml_diff>
--- a/public/templates/DOC-2.docx
+++ b/public/templates/DOC-2.docx
@@ -2140,7 +2140,7 @@
                 <w:szCs w:val="20"/>
                 <w:u w:val="single"/>
               </w:rPr>
-              <w:t xml:space="preserve">　　</w:t>
+              <w:t xml:space="preserve">{project_years}</w:t>
             </w:r>
             <w:r>
               <w:rPr>
@@ -2662,7 +2662,7 @@
                 <w:sz w:val="20"/>
                 <w:szCs w:val="20"/>
               </w:rPr>
-              <w:t>{exec_start_y}</w:t>
+              <w:t>{full_exec_start_y}</w:t>
             </w:r>
           </w:p>
         </w:tc>
@@ -2693,7 +2693,7 @@
                 <w:sz w:val="20"/>
                 <w:szCs w:val="20"/>
               </w:rPr>
-              <w:t>{exec_start_m}</w:t>
+              <w:t>{full_exec_start_m}</w:t>
             </w:r>
           </w:p>
         </w:tc>
@@ -2723,7 +2723,7 @@
                 <w:sz w:val="20"/>
                 <w:szCs w:val="20"/>
               </w:rPr>
-              <w:t>{exec_start_d}</w:t>
+              <w:t>{full_exec_start_d}</w:t>
             </w:r>
           </w:p>
         </w:tc>
@@ -3374,7 +3374,7 @@
                 <w:sz w:val="20"/>
                 <w:szCs w:val="20"/>
               </w:rPr>
-              <w:t>{exec_end_y}</w:t>
+              <w:t>{full_exec_end_y}</w:t>
             </w:r>
           </w:p>
         </w:tc>
@@ -3405,7 +3405,7 @@
                 <w:sz w:val="20"/>
                 <w:szCs w:val="20"/>
               </w:rPr>
-              <w:t>{exec_end_m}</w:t>
+              <w:t>{full_exec_end_m}</w:t>
             </w:r>
           </w:p>
         </w:tc>
@@ -3435,7 +3435,7 @@
                 <w:sz w:val="20"/>
                 <w:szCs w:val="20"/>
               </w:rPr>
-              <w:t>{exec_end_d}</w:t>
+              <w:t>{full_exec_end_d}</w:t>
             </w:r>
           </w:p>
         </w:tc>
@@ -5954,6 +5954,22 @@
           </w:tcPr>
           <w:p>
             <w:pPr>
+              <w:jc w:val="center"/>
+              <w:rPr>
+                <w:rFonts w:eastAsia="DFKai-SB" w:hint="eastAsia"/>
+                <w:b/>
+              </w:rPr>
+            </w:pPr>
+            <w:r>
+              <w:rPr>
+                <w:rFonts w:eastAsia="DFKai-SB" w:hint="eastAsia"/>
+                <w:b/>
+              </w:rPr>
+              <w:t>{#gantt_years}{year_label}</w:t>
+            </w:r>
+          </w:p>
+          <w:p>
+            <w:pPr>
               <w:jc w:val="right"/>
               <w:rPr>
                 <w:rFonts w:ascii="Times New Roman" w:eastAsia="DFKai-SB" w:hAnsi="Times New Roman" w:cs="Times New Roman"/>
@@ -6814,7 +6830,7 @@
               </w:rPr>
             </w:pPr>
             <w:r>
-              <w:t>{/gantt_rows}</w:t>
+              <w:t>{/gantt_rows}{/gantt_years}</w:t>
             </w:r>
           </w:p>
         </w:tc>

</xml_diff>